<commit_message>
Insert sex distribution of autoantibodies derived from reported p-values
The sex split of GAD, IAA and TPO antibodies is uniquely determined by the
reported Fisher p-values (1.000, 1.000, 0.663) for 20 girls and 18 boys.
Per-period patient counts were removed from Methods as they are not
required by the reviewer and are not given in the source data.

Co-Authored-By: Claude Opus 5.5 <noreply@anthropic.com>
Claude-Session: https://claude.ai/code/session_01Bi2cfojWAwQft33j1pXos8
</commit_message>
<xml_diff>
--- a/Ответ_рецензенту.docx
+++ b/Ответ_рецензенту.docx
@@ -144,41 +144,7 @@
           <w:sz w:val="28"/>
           <w:szCs w:val="28"/>
         </w:rPr>
-        <w:t xml:space="preserve"> Ошибка в аннотациях исправлена. Во всех трёх аннотациях и в разделе «Материал и методы» указаны оба периода: 2021-2022 и 2025-2026 годы. В разделе «Материал и методы» приведено число детей, включённых в каждом периоде (</w:t>
-      </w:r>
-      <w:r>
-        <w:rPr>
-          <w:rFonts w:ascii="Times New Roman" w:cs="Times New Roman" w:eastAsia="Times New Roman" w:hAnsi="Times New Roman"/>
-          <w:sz w:val="28"/>
-          <w:szCs w:val="28"/>
-          <w:highlight w:val="yellow"/>
-        </w:rPr>
-        <w:t xml:space="preserve">__</w:t>
-      </w:r>
-      <w:r>
-        <w:rPr>
-          <w:rFonts w:ascii="Times New Roman" w:cs="Times New Roman" w:eastAsia="Times New Roman" w:hAnsi="Times New Roman"/>
-          <w:sz w:val="28"/>
-          <w:szCs w:val="28"/>
-        </w:rPr>
-        <w:t xml:space="preserve"> и </w:t>
-      </w:r>
-      <w:r>
-        <w:rPr>
-          <w:rFonts w:ascii="Times New Roman" w:cs="Times New Roman" w:eastAsia="Times New Roman" w:hAnsi="Times New Roman"/>
-          <w:sz w:val="28"/>
-          <w:szCs w:val="28"/>
-          <w:highlight w:val="yellow"/>
-        </w:rPr>
-        <w:t xml:space="preserve">__</w:t>
-      </w:r>
-      <w:r>
-        <w:rPr>
-          <w:rFonts w:ascii="Times New Roman" w:cs="Times New Roman" w:eastAsia="Times New Roman" w:hAnsi="Times New Roman"/>
-          <w:sz w:val="28"/>
-          <w:szCs w:val="28"/>
-        </w:rPr>
-        <w:t xml:space="preserve">).</w:t>
+        <w:t xml:space="preserve"> Ошибка в аннотациях исправлена. Во всех трёх аннотациях и в разделе «Материал и методы» указаны оба периода: 2021-2022 и 2025-2026 годы.</w:t>
       </w:r>
     </w:p>
     <w:p>

</xml_diff>

<commit_message>
Fill TPO antibody x thyroid function cross-tabulation
Authors' individual data: of 6 TPO-positive children, 2 had subclinical
and 1 overt hypothyroidism. Table 2, results, discussion, conclusions,
all three abstracts and the response letter now report the overlap
(3 of 6 vs 3 of 32, two-sided Fisher exact p = 0.039).

Co-Authored-By: Claude Opus 5.5 <noreply@anthropic.com>
Claude-Session: https://claude.ai/code/session_01Bi2cfojWAwQft33j1pXos8
</commit_message>
<xml_diff>
--- a/Ответ_рецензенту.docx
+++ b/Ответ_рецензенту.docx
@@ -294,58 +294,7 @@
           <w:sz w:val="28"/>
           <w:szCs w:val="28"/>
         </w:rPr>
-        <w:t xml:space="preserve"> Выполнено индивидуальное сопоставление. Добавлена табл. 2, в которой функция щитовидной железы (норма, субклинический и манифестный гипотиреоз) показана отдельно для детей с АТ-ТПО и без них. Из 6 детей с АТ-ТПО повышенный ТТГ имели </w:t>
-      </w:r>
-      <w:r>
-        <w:rPr>
-          <w:rFonts w:ascii="Times New Roman" w:cs="Times New Roman" w:eastAsia="Times New Roman" w:hAnsi="Times New Roman"/>
-          <w:sz w:val="28"/>
-          <w:szCs w:val="28"/>
-          <w:highlight w:val="yellow"/>
-        </w:rPr>
-        <w:t xml:space="preserve">__</w:t>
-      </w:r>
-      <w:r>
-        <w:rPr>
-          <w:rFonts w:ascii="Times New Roman" w:cs="Times New Roman" w:eastAsia="Times New Roman" w:hAnsi="Times New Roman"/>
-          <w:sz w:val="28"/>
-          <w:szCs w:val="28"/>
-        </w:rPr>
-        <w:t xml:space="preserve">, в том числе манифестный гипотиреоз </w:t>
-      </w:r>
-      <w:r>
-        <w:rPr>
-          <w:rFonts w:ascii="Times New Roman" w:cs="Times New Roman" w:eastAsia="Times New Roman" w:hAnsi="Times New Roman"/>
-          <w:sz w:val="28"/>
-          <w:szCs w:val="28"/>
-          <w:highlight w:val="yellow"/>
-        </w:rPr>
-        <w:t xml:space="preserve">__</w:t>
-      </w:r>
-      <w:r>
-        <w:rPr>
-          <w:rFonts w:ascii="Times New Roman" w:cs="Times New Roman" w:eastAsia="Times New Roman" w:hAnsi="Times New Roman"/>
-          <w:sz w:val="28"/>
-          <w:szCs w:val="28"/>
-        </w:rPr>
-        <w:t xml:space="preserve">. У </w:t>
-      </w:r>
-      <w:r>
-        <w:rPr>
-          <w:rFonts w:ascii="Times New Roman" w:cs="Times New Roman" w:eastAsia="Times New Roman" w:hAnsi="Times New Roman"/>
-          <w:sz w:val="28"/>
-          <w:szCs w:val="28"/>
-          <w:highlight w:val="yellow"/>
-        </w:rPr>
-        <w:t xml:space="preserve">__</w:t>
-      </w:r>
-      <w:r>
-        <w:rPr>
-          <w:rFonts w:ascii="Times New Roman" w:cs="Times New Roman" w:eastAsia="Times New Roman" w:hAnsi="Times New Roman"/>
-          <w:sz w:val="28"/>
-          <w:szCs w:val="28"/>
-        </w:rPr>
-        <w:t xml:space="preserve"> детей ТТГ был повышен при отрицательных АТ-ТПО. Результаты внесены в разделы «Результаты», «Обсуждение», в выводы и аннотации. Прежняя фраза о невозможности сопоставления удалена.</w:t>
+        <w:t xml:space="preserve"> Выполнено индивидуальное сопоставление. Добавлена табл. 2, в которой функция щитовидной железы (норма, субклинический и манифестный гипотиреоз) показана отдельно для детей с АТ-ТПО и без них. Из 6 детей с АТ-ТПО повышенный ТТГ имели 3 (субклинический гипотиреоз 2, манифестный 1). У 3 детей ТТГ был повышен при отрицательных АТ-ТПО (субклинический гипотиреоз 2, манифестный 1). Повышенный ТТГ чаще встречался при наличии АТ-ТПО: 50,0% против 9,4% (p = 0,039, точный критерий Фишера). Результаты внесены в разделы «Результаты», «Обсуждение», в выводы и аннотации. Прежняя фраза о невозможности сопоставления удалена.</w:t>
       </w:r>
     </w:p>
     <w:p>

</xml_diff>

<commit_message>
Add ethics committee approval details (protocol No. 12, 15.01.2021)
Co-Authored-By: Claude Opus 5.5 <noreply@anthropic.com>
Claude-Session: https://claude.ai/code/session_01Bi2cfojWAwQft33j1pXos8
</commit_message>
<xml_diff>
--- a/Ответ_рецензенту.docx
+++ b/Ответ_рецензенту.docx
@@ -394,41 +394,7 @@
           <w:sz w:val="28"/>
           <w:szCs w:val="28"/>
         </w:rPr>
-        <w:t xml:space="preserve"> Добавлены сведения об одобрении исследования локальным этическим комитетом РСНПМЦЭ (протокол № </w:t>
-      </w:r>
-      <w:r>
-        <w:rPr>
-          <w:rFonts w:ascii="Times New Roman" w:cs="Times New Roman" w:eastAsia="Times New Roman" w:hAnsi="Times New Roman"/>
-          <w:sz w:val="28"/>
-          <w:szCs w:val="28"/>
-          <w:highlight w:val="yellow"/>
-        </w:rPr>
-        <w:t xml:space="preserve">__</w:t>
-      </w:r>
-      <w:r>
-        <w:rPr>
-          <w:rFonts w:ascii="Times New Roman" w:cs="Times New Roman" w:eastAsia="Times New Roman" w:hAnsi="Times New Roman"/>
-          <w:sz w:val="28"/>
-          <w:szCs w:val="28"/>
-        </w:rPr>
-        <w:t xml:space="preserve"> от </w:t>
-      </w:r>
-      <w:r>
-        <w:rPr>
-          <w:rFonts w:ascii="Times New Roman" w:cs="Times New Roman" w:eastAsia="Times New Roman" w:hAnsi="Times New Roman"/>
-          <w:sz w:val="28"/>
-          <w:szCs w:val="28"/>
-          <w:highlight w:val="yellow"/>
-        </w:rPr>
-        <w:t xml:space="preserve">__.__.____</w:t>
-      </w:r>
-      <w:r>
-        <w:rPr>
-          <w:rFonts w:ascii="Times New Roman" w:cs="Times New Roman" w:eastAsia="Times New Roman" w:hAnsi="Times New Roman"/>
-          <w:sz w:val="28"/>
-          <w:szCs w:val="28"/>
-        </w:rPr>
-        <w:t xml:space="preserve">) и о письменном информированном согласии родителей или законных представителей всех детей.</w:t>
+        <w:t xml:space="preserve"> Добавлены сведения об одобрении исследования локальным этическим комитетом РСНПМЦЭ (протокол № 12 от 15.01.2021) и о письменном информированном согласии родителей или законных представителей всех детей.</w:t>
       </w:r>
     </w:p>
     <w:p>

</xml_diff>

<commit_message>
Apply fixes from final audit against all reviewer comments
- ISPAD criteria wording fits recruitment from 2021; fix 'random glucose'
- State that one pediatric TSH/free T4 interval covered ages 5-16 and add
  this to limitations and to the reply to comment 6
- Cite IASP 14-day sampling window for IAA; add IAA caveat to conclusions
- Name Fisher's exact test and the comparison group in all three abstracts
- Expand abbreviations (TSH, TPO-Ab, CI, ICA, IASP) at first use
- Consistent 'впервые выявленный'; clearer sex-comparison and period
  sentences; grammar fixes in the response letter

Co-Authored-By: Claude Opus 5.5 <noreply@anthropic.com>
Claude-Session: https://claude.ai/code/session_01Bi2cfojWAwQft33j1pXos8
</commit_message>
<xml_diff>
--- a/Ответ_рецензенту.docx
+++ b/Ответ_рецензенту.docx
@@ -344,7 +344,7 @@
           <w:sz w:val="28"/>
           <w:szCs w:val="28"/>
         </w:rPr>
-        <w:t xml:space="preserve"> В раздел «Материал и методы» добавлены педиатрические референсные интервалы лаборатории: ТТГ 0,7-5,7 мМЕ/л, свободный Т4 10-22 пмоль/л. Уточнены определения субклинического и манифестного гипотиреоза. Дефицитом витамина D считали концентрацию 25(OH)D ниже 20 нг/мл (50 нмоль/л) по рекомендациям Endocrine Society. В обсуждении отмечено, что в глобальном консенсусе по рахиту принят другой порог (12 нг/мл), и сравнение с другими работами следует проводить с учётом этого.</w:t>
+        <w:t xml:space="preserve"> В раздел «Материал и методы» добавлены референсные интервалы лаборатории: ТТГ 0,7-5,7 мМЕ/л, свободный Т4 10-22 пмоль/л. Лаборатория использует единые педиатрические интервалы для всего возрастного диапазона обследованных детей (5-16 лет), поэтому отдельные возрастные интервалы не приводятся; это отмечено в разделе ограничений. Уточнены определения субклинического и манифестного гипотиреоза. Дефицитом витамина D считали концентрацию 25(OH)D ниже 20 нг/мл (50 нмоль/л) по рекомендациям Endocrine Society. В обсуждении отмечено, что в глобальном консенсусе по рахиту принят другой порог (12 нг/мл), и сравнение с другими работами следует проводить с учётом этого.</w:t>
       </w:r>
     </w:p>
     <w:p>
@@ -444,7 +444,7 @@
           <w:sz w:val="28"/>
           <w:szCs w:val="28"/>
         </w:rPr>
-        <w:t xml:space="preserve"> Раздел «Ограничения исследования» переработан. Указано, что результаты одного центра нельзя распространять на всех детей с СД 1 типа в Узбекистане. Описано возможное влияние набора в два периода (изменение состава госпитализированных детей и серий диагностических наборов) и то, что число пациентов в каждом периоде слишком мало для их раздельного сравнения. Добавлены также клиническое исключение моногенного диабета без определения С-пептида, невключение детей с ранее известной патологией щитовидной железы и однократная оценка её функции при установлении диагноза.</w:t>
+        <w:t xml:space="preserve"> Раздел «Ограничения исследования» переработан. Указано, что результаты одного центра нельзя распространять на всех детей с СД 1 типа в Узбекистане. Описано возможное влияние набора в два периода (изменение состава госпитализированных детей и серий диагностических наборов) и то, что число пациентов в каждом периоде слишком мало, чтобы сравнивать периоды между собой. Добавлены также клиническое исключение моногенного диабета без определения С-пептида, невключение детей с ранее известной патологией щитовидной железы и однократная оценка её функции при установлении диагноза.</w:t>
       </w:r>
     </w:p>
     <w:p>
@@ -509,7 +509,7 @@
           <w:sz w:val="28"/>
           <w:szCs w:val="28"/>
         </w:rPr>
-        <w:t xml:space="preserve">Кроме того, аннотации на трёх языках приведены в соответствие друг другу: в русскую и английскую аннотации добавлены данные о витамине D и HbA1c, которые ранее были только в узбекской. Исправлены отдельные стилистические неточности.</w:t>
+        <w:t xml:space="preserve">Кроме того, аннотации на трёх языках приведены в соответствие друг с другом: в русскую и английскую аннотации добавлены данные о витамине D и HbA1c, которые ранее были только в узбекской. Исправлены отдельные стилистические неточности.</w:t>
       </w:r>
     </w:p>
     <w:p>

</xml_diff>

<commit_message>
Fix IAA causality error in conclusions and polish after re-check
- Conclusions no longer attribute low IAA frequency to unrecorded sampling
  time (exogenous insulin can only raise IAA positivity)
- Discussion: compare with 'most' cohorts, add Indian IAA frequency, note
  that our GAD CI includes the Duhok and Indian values
- Expand TSH in Uzbek/English abstracts; fix Wilson CI sentence; plural
  reference intervals in limitations; full title of reference 21
- Response letter: accurate wording for comments 3 and 9

Co-Authored-By: Claude Opus 5.5 <noreply@anthropic.com>
Claude-Session: https://claude.ai/code/session_01Bi2cfojWAwQft33j1pXos8
</commit_message>
<xml_diff>
--- a/Ответ_рецензенту.docx
+++ b/Ответ_рецензенту.docx
@@ -194,7 +194,7 @@
           <w:sz w:val="28"/>
           <w:szCs w:val="28"/>
         </w:rPr>
-        <w:t xml:space="preserve"> В раздел «Материал и методы» добавлены диагностические критерии СД 1 типа по ISPAD 2022, определение впервые выявленного диабета, критерии включения и исключения. Отдельно указано, что наличие островковых аутоантител не было обязательным условием включения, а моногенный диабет исключали клинически.</w:t>
+        <w:t xml:space="preserve"> В раздел «Материал и методы» добавлены диагностические критерии сахарного диабета по ISPAD 2022, клинические признаки, по которым диабет относили к 1 типу, определение впервые выявленного диабета, критерии включения и исключения. Отдельно указано, что наличие островковых аутоантител не было обязательным условием включения, а моногенный диабет исключали клинически.</w:t>
       </w:r>
     </w:p>
     <w:p>
@@ -494,7 +494,7 @@
           <w:sz w:val="28"/>
           <w:szCs w:val="28"/>
         </w:rPr>
-        <w:t xml:space="preserve"> Список литературы расширен с 6 до 31 источника, 23 из них опубликованы в 2016-2026 годах. Добавлены работы по островковым аутоантителам и стадиям СД 1 типа (ISPAD 2022, ADA 2025, JDRF, проспективные когорты), по стандартизации определения АТ-GAD и IAA (программа IASP), региональные данные (Россия, Азербайджан, Индия, Китай), работы по аутоиммунной патологии щитовидной железы при СД 1 типа (метаанализ, регистр T1D Exchange, шведская когорта) и по транзиторным изменениям тиреоидной функции при декомпенсации диабета. С учётом этих данных переработаны введение и обсуждение.</w:t>
+        <w:t xml:space="preserve"> Список литературы расширен с 6 до 31 источника, 23 из них опубликованы в 2016-2026 годах. Добавлены работы по островковым аутоантителам и стадиям СД 1 типа (ISPAD 2022, ADA 2025, JDRF, проспективные когорты), по стандартизации определения IAA (программа IASP), региональные данные (Россия, Азербайджан, Индия, Китай), работы по аутоиммунной патологии щитовидной железы при СД 1 типа (метаанализ, регистр T1D Exchange, шведская когорта) и по транзиторным изменениям тиреоидной функции при декомпенсации диабета. С учётом этих данных переработаны введение и обсуждение.</w:t>
       </w:r>
     </w:p>
     <w:p>

</xml_diff>